<commit_message>
Refactored, manual updated; 04/08/2026
</commit_message>
<xml_diff>
--- a/project/_manual/manual.docx
+++ b/project/_manual/manual.docx
@@ -13,25 +13,10 @@
     </w:p>
     <w:p>
       <w:pPr>
-        <w:pStyle w:val="Heading1"/>
-      </w:pPr>
-      <w:proofErr w:type="spellStart"/>
-      <w:r>
-        <w:t>SimpleTideFilter</w:t>
-      </w:r>
-      <w:proofErr w:type="spellEnd"/>
-    </w:p>
-    <w:p>
-      <w:pPr>
         <w:jc w:val="both"/>
       </w:pPr>
-      <w:proofErr w:type="spellStart"/>
-      <w:r>
-        <w:t>SimpleTideFilter</w:t>
-      </w:r>
-      <w:proofErr w:type="spellEnd"/>
-      <w:r>
-        <w:t xml:space="preserve"> application was developed to </w:t>
+      <w:r>
+        <w:t xml:space="preserve">SimpleTideFilter application was developed to </w:t>
       </w:r>
       <w:r>
         <w:t xml:space="preserve">simplify and </w:t>
@@ -55,15 +40,7 @@
         <w:t xml:space="preserve"> environment</w:t>
       </w:r>
       <w:r>
-        <w:t xml:space="preserve">. With </w:t>
-      </w:r>
-      <w:proofErr w:type="spellStart"/>
-      <w:r>
-        <w:t>SimpleTideFilter</w:t>
-      </w:r>
-      <w:proofErr w:type="spellEnd"/>
-      <w:r>
-        <w:t xml:space="preserve"> it is possible to:</w:t>
+        <w:t>. With SimpleTideFilter it is possible to:</w:t>
       </w:r>
     </w:p>
     <w:p>
@@ -102,7 +79,7 @@
         <w:jc w:val="both"/>
       </w:pPr>
       <w:r>
-        <w:t>Reject (de-spike) observed data;</w:t>
+        <w:t>Augment and align missing data;</w:t>
       </w:r>
     </w:p>
     <w:p>
@@ -115,6 +92,19 @@
         <w:jc w:val="both"/>
       </w:pPr>
       <w:r>
+        <w:t>Reject (de-spike) observed data;</w:t>
+      </w:r>
+    </w:p>
+    <w:p>
+      <w:pPr>
+        <w:pStyle w:val="ListParagraph"/>
+        <w:numPr>
+          <w:ilvl w:val="0"/>
+          <w:numId w:val="1"/>
+        </w:numPr>
+        <w:jc w:val="both"/>
+      </w:pPr>
+      <w:r>
         <w:t>Apply FIR, Gaussian, Median or Mean filter to smooth decimated data.</w:t>
       </w:r>
     </w:p>
@@ -131,17 +121,17 @@
     </w:p>
     <w:p>
       <w:pPr>
-        <w:jc w:val="both"/>
+        <w:jc w:val="center"/>
       </w:pPr>
       <w:r>
         <w:rPr>
           <w:noProof/>
         </w:rPr>
         <w:drawing>
-          <wp:inline distT="0" distB="0" distL="0" distR="0" wp14:anchorId="0CA7EBED" wp14:editId="4F6F54CA">
-            <wp:extent cx="5727700" cy="3591560"/>
-            <wp:effectExtent l="0" t="0" r="6350" b="8890"/>
-            <wp:docPr id="972365153" name="Picture 2"/>
+          <wp:inline distT="0" distB="0" distL="0" distR="0" wp14:anchorId="45070DD8" wp14:editId="5871D8F7">
+            <wp:extent cx="5724525" cy="3438525"/>
+            <wp:effectExtent l="0" t="0" r="9525" b="9525"/>
+            <wp:docPr id="1404103750" name="Picture 1"/>
             <wp:cNvGraphicFramePr>
               <a:graphicFrameLocks xmlns:a="http://schemas.openxmlformats.org/drawingml/2006/main" noChangeAspect="1"/>
             </wp:cNvGraphicFramePr>
@@ -149,13 +139,13 @@
               <a:graphicData uri="http://schemas.openxmlformats.org/drawingml/2006/picture">
                 <pic:pic xmlns:pic="http://schemas.openxmlformats.org/drawingml/2006/picture">
                   <pic:nvPicPr>
-                    <pic:cNvPr id="0" name="Picture 2"/>
+                    <pic:cNvPr id="0" name="Picture 1"/>
                     <pic:cNvPicPr>
                       <a:picLocks noChangeAspect="1" noChangeArrowheads="1"/>
                     </pic:cNvPicPr>
                   </pic:nvPicPr>
                   <pic:blipFill>
-                    <a:blip r:embed="rId8">
+                    <a:blip r:embed="rId8" cstate="print">
                       <a:extLst>
                         <a:ext uri="{28A0092B-C50C-407E-A947-70E740481C1C}">
                           <a14:useLocalDpi xmlns:a14="http://schemas.microsoft.com/office/drawing/2010/main" val="0"/>
@@ -170,7 +160,7 @@
                   <pic:spPr bwMode="auto">
                     <a:xfrm>
                       <a:off x="0" y="0"/>
-                      <a:ext cx="5727700" cy="3591560"/>
+                      <a:ext cx="5724525" cy="3438525"/>
                     </a:xfrm>
                     <a:prstGeom prst="rect">
                       <a:avLst/>
@@ -220,27 +210,16 @@
         <w:jc w:val="both"/>
       </w:pPr>
       <w:r>
-        <w:t xml:space="preserve">The application is sensitive to foreign data like headers, corrupted strings, etc. and may fail to load data should those exist in the data files. Prior to import data, irrelevant strings </w:t>
+        <w:t xml:space="preserve">The application is sensitive to foreign data like headers, corrupted strings, etc. and may fail to load data should those exist in the data files. Prior to import data, irrelevant strings should be removed from the files. For example, Qinsy acquisition software adds multiple header lines in the </w:t>
+      </w:r>
+      <w:r>
+        <w:t xml:space="preserve">RTK tide </w:t>
+      </w:r>
+      <w:r>
+        <w:t xml:space="preserve">files when logging. Those header lines should be removed. If </w:t>
       </w:r>
       <w:r>
         <w:lastRenderedPageBreak/>
-        <w:t xml:space="preserve">should be removed from the files. For example, </w:t>
-      </w:r>
-      <w:proofErr w:type="spellStart"/>
-      <w:r>
-        <w:t>Qinsy</w:t>
-      </w:r>
-      <w:proofErr w:type="spellEnd"/>
-      <w:r>
-        <w:t xml:space="preserve"> acquisition software adds multiple header lines in the </w:t>
-      </w:r>
-      <w:r>
-        <w:t xml:space="preserve">RTK tide </w:t>
-      </w:r>
-      <w:r>
-        <w:t xml:space="preserve">files when logging. Those header lines should be removed. If </w:t>
-      </w:r>
-      <w:r>
         <w:t>data</w:t>
       </w:r>
       <w:r>
@@ -270,12 +249,79 @@
       <w:r>
         <w:t>Configuring file and data format</w:t>
       </w:r>
+      <w:r>
+        <w:t>s</w:t>
+      </w:r>
     </w:p>
     <w:p>
       <w:pPr>
         <w:jc w:val="both"/>
       </w:pPr>
       <w:r>
+        <w:t xml:space="preserve">Application configuration settings are saved in ./_internal/cfg.json file. Those can be accessed by selecting </w:t>
+      </w:r>
+      <w:r>
+        <w:rPr>
+          <w:b/>
+          <w:bCs/>
+        </w:rPr>
+        <w:t>‘File -&gt; Edit config’</w:t>
+      </w:r>
+      <w:r>
+        <w:t xml:space="preserve"> menu:</w:t>
+      </w:r>
+    </w:p>
+    <w:p>
+      <w:pPr>
+        <w:ind w:left="709"/>
+        <w:jc w:val="center"/>
+      </w:pPr>
+      <w:r>
+        <w:rPr>
+          <w:noProof/>
+        </w:rPr>
+        <w:drawing>
+          <wp:inline distT="0" distB="0" distL="0" distR="0" wp14:anchorId="11ECA73D" wp14:editId="3ED87C44">
+            <wp:extent cx="3267878" cy="1080000"/>
+            <wp:effectExtent l="0" t="0" r="0" b="6350"/>
+            <wp:docPr id="2127688165" name="Picture 1"/>
+            <wp:cNvGraphicFramePr>
+              <a:graphicFrameLocks xmlns:a="http://schemas.openxmlformats.org/drawingml/2006/main" noChangeAspect="1"/>
+            </wp:cNvGraphicFramePr>
+            <a:graphic xmlns:a="http://schemas.openxmlformats.org/drawingml/2006/main">
+              <a:graphicData uri="http://schemas.openxmlformats.org/drawingml/2006/picture">
+                <pic:pic xmlns:pic="http://schemas.openxmlformats.org/drawingml/2006/picture">
+                  <pic:nvPicPr>
+                    <pic:cNvPr id="2127688165" name=""/>
+                    <pic:cNvPicPr/>
+                  </pic:nvPicPr>
+                  <pic:blipFill>
+                    <a:blip r:embed="rId9"/>
+                    <a:stretch>
+                      <a:fillRect/>
+                    </a:stretch>
+                  </pic:blipFill>
+                  <pic:spPr>
+                    <a:xfrm>
+                      <a:off x="0" y="0"/>
+                      <a:ext cx="3267878" cy="1080000"/>
+                    </a:xfrm>
+                    <a:prstGeom prst="rect">
+                      <a:avLst/>
+                    </a:prstGeom>
+                  </pic:spPr>
+                </pic:pic>
+              </a:graphicData>
+            </a:graphic>
+          </wp:inline>
+        </w:drawing>
+      </w:r>
+    </w:p>
+    <w:p>
+      <w:pPr>
+        <w:jc w:val="both"/>
+      </w:pPr>
+      <w:r>
         <w:t>Apart from ‘</w:t>
       </w:r>
       <w:r>
@@ -286,7 +332,10 @@
         <w:t>Lines to skip</w:t>
       </w:r>
       <w:r>
-        <w:t>’ setting, there are three settings that may be configured:</w:t>
+        <w:t xml:space="preserve">’ setting, there are three settings that may be </w:t>
+      </w:r>
+      <w:r>
+        <w:t>configured:</w:t>
       </w:r>
     </w:p>
     <w:p>
@@ -306,7 +355,7 @@
           <w:b/>
           <w:bCs/>
         </w:rPr>
-        <w:t>Data fields</w:t>
+        <w:t>File format</w:t>
       </w:r>
       <w:r>
         <w:t xml:space="preserve">’ setting specifies data string format. As noted above, the </w:t>
@@ -333,182 +382,136 @@
         <w:t>See examples below:</w:t>
       </w:r>
     </w:p>
-    <w:tbl>
-      <w:tblPr>
-        <w:tblStyle w:val="TableGrid"/>
-        <w:tblW w:w="8363" w:type="dxa"/>
-        <w:tblInd w:w="704" w:type="dxa"/>
-        <w:tblBorders>
-          <w:top w:val="none" w:sz="0" w:space="0" w:color="auto"/>
-          <w:left w:val="none" w:sz="0" w:space="0" w:color="auto"/>
-          <w:bottom w:val="none" w:sz="0" w:space="0" w:color="auto"/>
-          <w:right w:val="none" w:sz="0" w:space="0" w:color="auto"/>
-          <w:insideH w:val="none" w:sz="0" w:space="0" w:color="auto"/>
-          <w:insideV w:val="none" w:sz="0" w:space="0" w:color="auto"/>
-        </w:tblBorders>
-        <w:tblLook w:val="04A0" w:firstRow="1" w:lastRow="0" w:firstColumn="1" w:lastColumn="0" w:noHBand="0" w:noVBand="1"/>
-      </w:tblPr>
-      <w:tblGrid>
-        <w:gridCol w:w="5240"/>
-        <w:gridCol w:w="3123"/>
-      </w:tblGrid>
-      <w:tr>
-        <w:tc>
-          <w:tcPr>
-            <w:tcW w:w="5240" w:type="dxa"/>
-          </w:tcPr>
-          <w:p>
-            <w:pPr>
-              <w:jc w:val="both"/>
-            </w:pPr>
-            <w:r>
-              <w:t>06/04/2026,00:00:</w:t>
-            </w:r>
-            <w:proofErr w:type="gramStart"/>
-            <w:r>
-              <w:t>00,-</w:t>
-            </w:r>
-            <w:proofErr w:type="gramEnd"/>
-            <w:r>
-              <w:t>0.19</w:t>
-            </w:r>
-          </w:p>
-        </w:tc>
-        <w:tc>
-          <w:tcPr>
-            <w:tcW w:w="3123" w:type="dxa"/>
-          </w:tcPr>
-          <w:p>
-            <w:pPr>
-              <w:jc w:val="both"/>
-            </w:pPr>
-            <w:proofErr w:type="spellStart"/>
-            <w:proofErr w:type="gramStart"/>
-            <w:r>
-              <w:t>Date,Time</w:t>
-            </w:r>
-            <w:proofErr w:type="gramEnd"/>
-            <w:r>
-              <w:t>,Tide</w:t>
-            </w:r>
-            <w:proofErr w:type="spellEnd"/>
-          </w:p>
-        </w:tc>
-      </w:tr>
-      <w:tr>
-        <w:tc>
-          <w:tcPr>
-            <w:tcW w:w="5240" w:type="dxa"/>
-          </w:tcPr>
-          <w:p>
-            <w:pPr>
-              <w:jc w:val="both"/>
-            </w:pPr>
-            <w:r>
-              <w:t>06/04/2026</w:t>
-            </w:r>
-            <w:r>
-              <w:t xml:space="preserve"> </w:t>
-            </w:r>
-            <w:r>
-              <w:t>00:00:00</w:t>
-            </w:r>
-            <w:r>
-              <w:tab/>
-            </w:r>
-            <w:r>
-              <w:tab/>
-            </w:r>
-            <w:r>
-              <w:t>-0.19</w:t>
-            </w:r>
-          </w:p>
-        </w:tc>
-        <w:tc>
-          <w:tcPr>
-            <w:tcW w:w="3123" w:type="dxa"/>
-          </w:tcPr>
-          <w:p>
-            <w:pPr>
-              <w:jc w:val="both"/>
-            </w:pPr>
-            <w:proofErr w:type="spellStart"/>
-            <w:proofErr w:type="gramStart"/>
-            <w:r>
-              <w:t>Date,Time</w:t>
-            </w:r>
-            <w:proofErr w:type="gramEnd"/>
-            <w:r>
-              <w:t>,Tide</w:t>
-            </w:r>
-            <w:proofErr w:type="spellEnd"/>
-          </w:p>
-        </w:tc>
-      </w:tr>
-      <w:tr>
-        <w:tc>
-          <w:tcPr>
-            <w:tcW w:w="5240" w:type="dxa"/>
-          </w:tcPr>
-          <w:p>
-            <w:pPr>
-              <w:jc w:val="both"/>
-            </w:pPr>
-            <w:r>
-              <w:t>06/04/2026,00:00:</w:t>
-            </w:r>
-            <w:proofErr w:type="gramStart"/>
-            <w:r>
-              <w:t>00,-</w:t>
-            </w:r>
-            <w:proofErr w:type="gramEnd"/>
-            <w:r>
-              <w:t>0.19</w:t>
-            </w:r>
-            <w:r>
-              <w:t>,000,111,222</w:t>
-            </w:r>
-          </w:p>
-        </w:tc>
-        <w:tc>
-          <w:tcPr>
-            <w:tcW w:w="3123" w:type="dxa"/>
-          </w:tcPr>
-          <w:p>
-            <w:pPr>
-              <w:jc w:val="both"/>
-            </w:pPr>
-            <w:proofErr w:type="spellStart"/>
-            <w:proofErr w:type="gramStart"/>
-            <w:r>
-              <w:t>Date,Time</w:t>
-            </w:r>
-            <w:proofErr w:type="gramEnd"/>
-            <w:r>
-              <w:t>,</w:t>
-            </w:r>
-            <w:proofErr w:type="gramStart"/>
-            <w:r>
-              <w:t>Tide,A</w:t>
-            </w:r>
-            <w:proofErr w:type="gramEnd"/>
-            <w:r>
-              <w:t>,</w:t>
-            </w:r>
-            <w:proofErr w:type="gramStart"/>
-            <w:r>
-              <w:t>B,C</w:t>
-            </w:r>
-            <w:proofErr w:type="spellEnd"/>
-            <w:proofErr w:type="gramEnd"/>
-          </w:p>
-        </w:tc>
-      </w:tr>
-    </w:tbl>
-    <w:p>
-      <w:pPr>
+    <w:p>
+      <w:pPr>
+        <w:ind w:left="709"/>
+        <w:jc w:val="center"/>
+      </w:pPr>
+      <w:r>
+        <w:rPr>
+          <w:noProof/>
+        </w:rPr>
+        <w:drawing>
+          <wp:inline distT="0" distB="0" distL="0" distR="0" wp14:anchorId="36496F84" wp14:editId="7116A4BB">
+            <wp:extent cx="1269600" cy="360000"/>
+            <wp:effectExtent l="0" t="0" r="6985" b="2540"/>
+            <wp:docPr id="557776048" name="Picture 1"/>
+            <wp:cNvGraphicFramePr>
+              <a:graphicFrameLocks xmlns:a="http://schemas.openxmlformats.org/drawingml/2006/main" noChangeAspect="1"/>
+            </wp:cNvGraphicFramePr>
+            <a:graphic xmlns:a="http://schemas.openxmlformats.org/drawingml/2006/main">
+              <a:graphicData uri="http://schemas.openxmlformats.org/drawingml/2006/picture">
+                <pic:pic xmlns:pic="http://schemas.openxmlformats.org/drawingml/2006/picture">
+                  <pic:nvPicPr>
+                    <pic:cNvPr id="557776048" name=""/>
+                    <pic:cNvPicPr/>
+                  </pic:nvPicPr>
+                  <pic:blipFill>
+                    <a:blip r:embed="rId10"/>
+                    <a:stretch>
+                      <a:fillRect/>
+                    </a:stretch>
+                  </pic:blipFill>
+                  <pic:spPr>
+                    <a:xfrm>
+                      <a:off x="0" y="0"/>
+                      <a:ext cx="1269600" cy="360000"/>
+                    </a:xfrm>
+                    <a:prstGeom prst="rect">
+                      <a:avLst/>
+                    </a:prstGeom>
+                  </pic:spPr>
+                </pic:pic>
+              </a:graphicData>
+            </a:graphic>
+          </wp:inline>
+        </w:drawing>
+      </w:r>
+    </w:p>
+    <w:p>
+      <w:pPr>
+        <w:ind w:left="709"/>
         <w:jc w:val="both"/>
       </w:pPr>
+      <w:r>
+        <w:t>The s</w:t>
+      </w:r>
+      <w:r>
+        <w:t xml:space="preserve">tring </w:t>
+      </w:r>
+      <w:r>
+        <w:t xml:space="preserve">above </w:t>
+      </w:r>
+      <w:r>
+        <w:t xml:space="preserve">contains </w:t>
+      </w:r>
+      <w:r>
+        <w:t xml:space="preserve">only </w:t>
+      </w:r>
+      <w:r>
+        <w:t>mandatory fields ‘Date’, ‘Time’ and ‘Tide’.</w:t>
+      </w:r>
+    </w:p>
+    <w:p>
+      <w:pPr>
+        <w:ind w:left="709"/>
+        <w:jc w:val="center"/>
+      </w:pPr>
+      <w:r>
+        <w:rPr>
+          <w:noProof/>
+        </w:rPr>
+        <w:drawing>
+          <wp:inline distT="0" distB="0" distL="0" distR="0" wp14:anchorId="4E6A2344" wp14:editId="660004DD">
+            <wp:extent cx="1615793" cy="360000"/>
+            <wp:effectExtent l="0" t="0" r="3810" b="2540"/>
+            <wp:docPr id="2081446686" name="Picture 1"/>
+            <wp:cNvGraphicFramePr>
+              <a:graphicFrameLocks xmlns:a="http://schemas.openxmlformats.org/drawingml/2006/main" noChangeAspect="1"/>
+            </wp:cNvGraphicFramePr>
+            <a:graphic xmlns:a="http://schemas.openxmlformats.org/drawingml/2006/main">
+              <a:graphicData uri="http://schemas.openxmlformats.org/drawingml/2006/picture">
+                <pic:pic xmlns:pic="http://schemas.openxmlformats.org/drawingml/2006/picture">
+                  <pic:nvPicPr>
+                    <pic:cNvPr id="2081446686" name=""/>
+                    <pic:cNvPicPr/>
+                  </pic:nvPicPr>
+                  <pic:blipFill>
+                    <a:blip r:embed="rId11"/>
+                    <a:stretch>
+                      <a:fillRect/>
+                    </a:stretch>
+                  </pic:blipFill>
+                  <pic:spPr>
+                    <a:xfrm>
+                      <a:off x="0" y="0"/>
+                      <a:ext cx="1615793" cy="360000"/>
+                    </a:xfrm>
+                    <a:prstGeom prst="rect">
+                      <a:avLst/>
+                    </a:prstGeom>
+                  </pic:spPr>
+                </pic:pic>
+              </a:graphicData>
+            </a:graphic>
+          </wp:inline>
+        </w:drawing>
+      </w:r>
+    </w:p>
+    <w:p>
+      <w:pPr>
+        <w:ind w:left="709"/>
+        <w:jc w:val="both"/>
+      </w:pPr>
+      <w:r>
+        <w:t>The string above</w:t>
+      </w:r>
+      <w:r>
+        <w:t xml:space="preserve"> contains unnecessary alphanumerical fields that must be tagged arbitrarily. These fields will not be considered in calculations.</w:t>
+      </w:r>
+      <w:r>
+        <w:t xml:space="preserve"> Another option is to delete the fields from the source file.</w:t>
+      </w:r>
     </w:p>
     <w:p>
       <w:pPr>
@@ -542,174 +545,137 @@
         <w:t xml:space="preserve"> of April 2026):</w:t>
       </w:r>
     </w:p>
-    <w:tbl>
-      <w:tblPr>
-        <w:tblStyle w:val="TableGrid"/>
-        <w:tblW w:w="8363" w:type="dxa"/>
-        <w:tblInd w:w="704" w:type="dxa"/>
-        <w:tblBorders>
-          <w:top w:val="none" w:sz="0" w:space="0" w:color="auto"/>
-          <w:left w:val="none" w:sz="0" w:space="0" w:color="auto"/>
-          <w:bottom w:val="none" w:sz="0" w:space="0" w:color="auto"/>
-          <w:right w:val="none" w:sz="0" w:space="0" w:color="auto"/>
-          <w:insideH w:val="none" w:sz="0" w:space="0" w:color="auto"/>
-          <w:insideV w:val="none" w:sz="0" w:space="0" w:color="auto"/>
-        </w:tblBorders>
-        <w:tblLook w:val="04A0" w:firstRow="1" w:lastRow="0" w:firstColumn="1" w:lastColumn="0" w:noHBand="0" w:noVBand="1"/>
-      </w:tblPr>
-      <w:tblGrid>
-        <w:gridCol w:w="2268"/>
-        <w:gridCol w:w="6095"/>
-      </w:tblGrid>
-      <w:tr>
-        <w:tc>
-          <w:tcPr>
-            <w:tcW w:w="2268" w:type="dxa"/>
-          </w:tcPr>
-          <w:p>
-            <w:pPr>
-              <w:jc w:val="both"/>
-            </w:pPr>
-            <w:r>
-              <w:t>06/04/2026</w:t>
-            </w:r>
-          </w:p>
-        </w:tc>
-        <w:tc>
-          <w:tcPr>
-            <w:tcW w:w="6095" w:type="dxa"/>
-          </w:tcPr>
-          <w:p>
-            <w:pPr>
-              <w:jc w:val="both"/>
-            </w:pPr>
-            <w:r>
-              <w:t>%d/%m/%Y</w:t>
-            </w:r>
-          </w:p>
-        </w:tc>
-      </w:tr>
-      <w:tr>
-        <w:tc>
-          <w:tcPr>
-            <w:tcW w:w="2268" w:type="dxa"/>
-          </w:tcPr>
-          <w:p>
-            <w:pPr>
-              <w:jc w:val="both"/>
-            </w:pPr>
-            <w:r>
-              <w:t>0</w:t>
-            </w:r>
-            <w:r>
-              <w:t>4</w:t>
-            </w:r>
-            <w:r>
-              <w:t>/0</w:t>
-            </w:r>
-            <w:r>
-              <w:t>6</w:t>
-            </w:r>
-            <w:r>
-              <w:t>/2026</w:t>
-            </w:r>
-          </w:p>
-        </w:tc>
-        <w:tc>
-          <w:tcPr>
-            <w:tcW w:w="6095" w:type="dxa"/>
-          </w:tcPr>
-          <w:p>
-            <w:pPr>
-              <w:jc w:val="both"/>
-            </w:pPr>
-            <w:r>
-              <w:t>%m/%d/%Y</w:t>
-            </w:r>
-          </w:p>
-        </w:tc>
-      </w:tr>
-      <w:tr>
-        <w:tc>
-          <w:tcPr>
-            <w:tcW w:w="2268" w:type="dxa"/>
-          </w:tcPr>
-          <w:p>
-            <w:pPr>
-              <w:jc w:val="both"/>
-            </w:pPr>
-            <w:r>
-              <w:t>06</w:t>
-            </w:r>
-            <w:r>
-              <w:t>-</w:t>
-            </w:r>
-            <w:r>
-              <w:t>04</w:t>
-            </w:r>
-            <w:r>
-              <w:t>-</w:t>
-            </w:r>
-            <w:r>
-              <w:t>2026</w:t>
-            </w:r>
-          </w:p>
-        </w:tc>
-        <w:tc>
-          <w:tcPr>
-            <w:tcW w:w="6095" w:type="dxa"/>
-          </w:tcPr>
-          <w:p>
-            <w:pPr>
-              <w:jc w:val="both"/>
-            </w:pPr>
-            <w:r>
-              <w:t>%d-%m-%Y</w:t>
-            </w:r>
-          </w:p>
-        </w:tc>
-      </w:tr>
-      <w:tr>
-        <w:tc>
-          <w:tcPr>
-            <w:tcW w:w="2268" w:type="dxa"/>
-          </w:tcPr>
-          <w:p>
-            <w:pPr>
-              <w:jc w:val="both"/>
-            </w:pPr>
-            <w:r>
-              <w:t>06:04:2026</w:t>
-            </w:r>
-          </w:p>
-        </w:tc>
-        <w:tc>
-          <w:tcPr>
-            <w:tcW w:w="6095" w:type="dxa"/>
-          </w:tcPr>
-          <w:p>
-            <w:pPr>
-              <w:jc w:val="both"/>
-            </w:pPr>
-            <w:r>
-              <w:t>%</w:t>
-            </w:r>
-            <w:proofErr w:type="gramStart"/>
-            <w:r>
-              <w:t>d:%m:%</w:t>
-            </w:r>
-            <w:proofErr w:type="gramEnd"/>
-            <w:r>
-              <w:t>Y</w:t>
-            </w:r>
-          </w:p>
-        </w:tc>
-      </w:tr>
-    </w:tbl>
-    <w:p>
-      <w:pPr>
-        <w:jc w:val="both"/>
-      </w:pPr>
+    <w:p>
+      <w:pPr>
+        <w:ind w:left="709"/>
+        <w:jc w:val="center"/>
+      </w:pPr>
+      <w:r>
+        <w:rPr>
+          <w:noProof/>
+        </w:rPr>
+        <w:drawing>
+          <wp:inline distT="0" distB="0" distL="0" distR="0" wp14:anchorId="22D45166" wp14:editId="68746536">
+            <wp:extent cx="595602" cy="360000"/>
+            <wp:effectExtent l="0" t="0" r="0" b="2540"/>
+            <wp:docPr id="1661859992" name="Picture 1"/>
+            <wp:cNvGraphicFramePr>
+              <a:graphicFrameLocks xmlns:a="http://schemas.openxmlformats.org/drawingml/2006/main" noChangeAspect="1"/>
+            </wp:cNvGraphicFramePr>
+            <a:graphic xmlns:a="http://schemas.openxmlformats.org/drawingml/2006/main">
+              <a:graphicData uri="http://schemas.openxmlformats.org/drawingml/2006/picture">
+                <pic:pic xmlns:pic="http://schemas.openxmlformats.org/drawingml/2006/picture">
+                  <pic:nvPicPr>
+                    <pic:cNvPr id="1661859992" name=""/>
+                    <pic:cNvPicPr/>
+                  </pic:nvPicPr>
+                  <pic:blipFill>
+                    <a:blip r:embed="rId12"/>
+                    <a:stretch>
+                      <a:fillRect/>
+                    </a:stretch>
+                  </pic:blipFill>
+                  <pic:spPr>
+                    <a:xfrm>
+                      <a:off x="0" y="0"/>
+                      <a:ext cx="595602" cy="360000"/>
+                    </a:xfrm>
+                    <a:prstGeom prst="rect">
+                      <a:avLst/>
+                    </a:prstGeom>
+                  </pic:spPr>
+                </pic:pic>
+              </a:graphicData>
+            </a:graphic>
+          </wp:inline>
+        </w:drawing>
+      </w:r>
+      <w:r>
+        <w:t xml:space="preserve">     </w:t>
+      </w:r>
+      <w:r>
+        <w:rPr>
+          <w:noProof/>
+        </w:rPr>
+        <w:drawing>
+          <wp:inline distT="0" distB="0" distL="0" distR="0" wp14:anchorId="5DD5C88E" wp14:editId="584245DC">
+            <wp:extent cx="563168" cy="360000"/>
+            <wp:effectExtent l="0" t="0" r="8890" b="2540"/>
+            <wp:docPr id="1973202614" name="Picture 1"/>
+            <wp:cNvGraphicFramePr>
+              <a:graphicFrameLocks xmlns:a="http://schemas.openxmlformats.org/drawingml/2006/main" noChangeAspect="1"/>
+            </wp:cNvGraphicFramePr>
+            <a:graphic xmlns:a="http://schemas.openxmlformats.org/drawingml/2006/main">
+              <a:graphicData uri="http://schemas.openxmlformats.org/drawingml/2006/picture">
+                <pic:pic xmlns:pic="http://schemas.openxmlformats.org/drawingml/2006/picture">
+                  <pic:nvPicPr>
+                    <pic:cNvPr id="1973202614" name=""/>
+                    <pic:cNvPicPr/>
+                  </pic:nvPicPr>
+                  <pic:blipFill>
+                    <a:blip r:embed="rId13"/>
+                    <a:stretch>
+                      <a:fillRect/>
+                    </a:stretch>
+                  </pic:blipFill>
+                  <pic:spPr>
+                    <a:xfrm>
+                      <a:off x="0" y="0"/>
+                      <a:ext cx="563168" cy="360000"/>
+                    </a:xfrm>
+                    <a:prstGeom prst="rect">
+                      <a:avLst/>
+                    </a:prstGeom>
+                  </pic:spPr>
+                </pic:pic>
+              </a:graphicData>
+            </a:graphic>
+          </wp:inline>
+        </w:drawing>
+      </w:r>
+      <w:r>
+        <w:t xml:space="preserve">     </w:t>
+      </w:r>
+      <w:r>
+        <w:rPr>
+          <w:noProof/>
+        </w:rPr>
+        <w:drawing>
+          <wp:inline distT="0" distB="0" distL="0" distR="0" wp14:anchorId="2AAA7D58" wp14:editId="701E0B5A">
+            <wp:extent cx="560807" cy="342000"/>
+            <wp:effectExtent l="0" t="0" r="0" b="1270"/>
+            <wp:docPr id="267917355" name="Picture 1"/>
+            <wp:cNvGraphicFramePr>
+              <a:graphicFrameLocks xmlns:a="http://schemas.openxmlformats.org/drawingml/2006/main" noChangeAspect="1"/>
+            </wp:cNvGraphicFramePr>
+            <a:graphic xmlns:a="http://schemas.openxmlformats.org/drawingml/2006/main">
+              <a:graphicData uri="http://schemas.openxmlformats.org/drawingml/2006/picture">
+                <pic:pic xmlns:pic="http://schemas.openxmlformats.org/drawingml/2006/picture">
+                  <pic:nvPicPr>
+                    <pic:cNvPr id="267917355" name=""/>
+                    <pic:cNvPicPr/>
+                  </pic:nvPicPr>
+                  <pic:blipFill>
+                    <a:blip r:embed="rId14"/>
+                    <a:stretch>
+                      <a:fillRect/>
+                    </a:stretch>
+                  </pic:blipFill>
+                  <pic:spPr>
+                    <a:xfrm>
+                      <a:off x="0" y="0"/>
+                      <a:ext cx="560807" cy="342000"/>
+                    </a:xfrm>
+                    <a:prstGeom prst="rect">
+                      <a:avLst/>
+                    </a:prstGeom>
+                  </pic:spPr>
+                </pic:pic>
+              </a:graphicData>
+            </a:graphic>
+          </wp:inline>
+        </w:drawing>
+      </w:r>
     </w:p>
     <w:p>
       <w:pPr>
@@ -741,199 +707,144 @@
         <w:t>’ setting specifies Time field format. See examples below:</w:t>
       </w:r>
     </w:p>
-    <w:tbl>
-      <w:tblPr>
-        <w:tblStyle w:val="TableGrid"/>
-        <w:tblW w:w="8363" w:type="dxa"/>
-        <w:tblInd w:w="704" w:type="dxa"/>
-        <w:tblBorders>
-          <w:top w:val="none" w:sz="0" w:space="0" w:color="auto"/>
-          <w:left w:val="none" w:sz="0" w:space="0" w:color="auto"/>
-          <w:bottom w:val="none" w:sz="0" w:space="0" w:color="auto"/>
-          <w:right w:val="none" w:sz="0" w:space="0" w:color="auto"/>
-          <w:insideH w:val="none" w:sz="0" w:space="0" w:color="auto"/>
-          <w:insideV w:val="none" w:sz="0" w:space="0" w:color="auto"/>
-        </w:tblBorders>
-        <w:tblLook w:val="04A0" w:firstRow="1" w:lastRow="0" w:firstColumn="1" w:lastColumn="0" w:noHBand="0" w:noVBand="1"/>
-      </w:tblPr>
-      <w:tblGrid>
-        <w:gridCol w:w="2268"/>
-        <w:gridCol w:w="6095"/>
-      </w:tblGrid>
-      <w:tr>
-        <w:tc>
-          <w:tcPr>
-            <w:tcW w:w="2268" w:type="dxa"/>
-          </w:tcPr>
-          <w:p>
-            <w:pPr>
-              <w:jc w:val="both"/>
-            </w:pPr>
-            <w:r>
-              <w:t>01:55:55</w:t>
-            </w:r>
-          </w:p>
-        </w:tc>
-        <w:tc>
-          <w:tcPr>
-            <w:tcW w:w="6095" w:type="dxa"/>
-          </w:tcPr>
-          <w:p>
-            <w:pPr>
-              <w:jc w:val="both"/>
-            </w:pPr>
-            <w:r>
-              <w:t>%</w:t>
-            </w:r>
-            <w:proofErr w:type="gramStart"/>
-            <w:r>
-              <w:t>H:%M:%</w:t>
-            </w:r>
-            <w:proofErr w:type="gramEnd"/>
-            <w:r>
-              <w:t>S</w:t>
-            </w:r>
-          </w:p>
-        </w:tc>
-      </w:tr>
-      <w:tr>
-        <w:tc>
-          <w:tcPr>
-            <w:tcW w:w="2268" w:type="dxa"/>
-          </w:tcPr>
-          <w:p>
-            <w:pPr>
-              <w:jc w:val="both"/>
-            </w:pPr>
-            <w:r>
-              <w:t>01:55:55.0</w:t>
-            </w:r>
-          </w:p>
-        </w:tc>
-        <w:tc>
-          <w:tcPr>
-            <w:tcW w:w="6095" w:type="dxa"/>
-          </w:tcPr>
-          <w:p>
-            <w:pPr>
-              <w:jc w:val="both"/>
-            </w:pPr>
-            <w:r>
-              <w:t>%</w:t>
-            </w:r>
-            <w:proofErr w:type="gramStart"/>
-            <w:r>
-              <w:t>H:%M:%</w:t>
-            </w:r>
-            <w:proofErr w:type="spellStart"/>
-            <w:proofErr w:type="gramEnd"/>
-            <w:r>
-              <w:t>S</w:t>
-            </w:r>
-            <w:r>
-              <w:t>.</w:t>
-            </w:r>
-            <w:r>
-              <w:t>%f</w:t>
-            </w:r>
-            <w:proofErr w:type="spellEnd"/>
-          </w:p>
-        </w:tc>
-      </w:tr>
-      <w:tr>
-        <w:tc>
-          <w:tcPr>
-            <w:tcW w:w="2268" w:type="dxa"/>
-          </w:tcPr>
-          <w:p>
-            <w:pPr>
-              <w:jc w:val="both"/>
-            </w:pPr>
-            <w:r>
-              <w:t>01:55:55.00</w:t>
-            </w:r>
-          </w:p>
-        </w:tc>
-        <w:tc>
-          <w:tcPr>
-            <w:tcW w:w="6095" w:type="dxa"/>
-          </w:tcPr>
-          <w:p>
-            <w:pPr>
-              <w:jc w:val="both"/>
-            </w:pPr>
-            <w:r>
-              <w:t>%</w:t>
-            </w:r>
-            <w:proofErr w:type="gramStart"/>
-            <w:r>
-              <w:t>H:%M:%</w:t>
-            </w:r>
-            <w:proofErr w:type="spellStart"/>
-            <w:proofErr w:type="gramEnd"/>
-            <w:r>
-              <w:t>S</w:t>
-            </w:r>
-            <w:r>
-              <w:t>.</w:t>
-            </w:r>
-            <w:r>
-              <w:t>%f</w:t>
-            </w:r>
-            <w:proofErr w:type="spellEnd"/>
-          </w:p>
-        </w:tc>
-      </w:tr>
-      <w:tr>
-        <w:tc>
-          <w:tcPr>
-            <w:tcW w:w="2268" w:type="dxa"/>
-          </w:tcPr>
-          <w:p>
-            <w:pPr>
-              <w:jc w:val="both"/>
-            </w:pPr>
-            <w:r>
-              <w:t>01:55:55.000</w:t>
-            </w:r>
-          </w:p>
-        </w:tc>
-        <w:tc>
-          <w:tcPr>
-            <w:tcW w:w="6095" w:type="dxa"/>
-          </w:tcPr>
-          <w:p>
-            <w:pPr>
-              <w:jc w:val="both"/>
-            </w:pPr>
-            <w:r>
-              <w:t>%</w:t>
-            </w:r>
-            <w:proofErr w:type="gramStart"/>
-            <w:r>
-              <w:t>H:%M:%</w:t>
-            </w:r>
-            <w:proofErr w:type="spellStart"/>
-            <w:proofErr w:type="gramEnd"/>
-            <w:r>
-              <w:t>S</w:t>
-            </w:r>
-            <w:r>
-              <w:t>.</w:t>
-            </w:r>
-            <w:r>
-              <w:t>%f</w:t>
-            </w:r>
-            <w:proofErr w:type="spellEnd"/>
-          </w:p>
-        </w:tc>
-      </w:tr>
-    </w:tbl>
+    <w:p>
+      <w:pPr>
+        <w:ind w:left="709"/>
+        <w:jc w:val="center"/>
+      </w:pPr>
+      <w:r>
+        <w:rPr>
+          <w:noProof/>
+        </w:rPr>
+        <w:drawing>
+          <wp:inline distT="0" distB="0" distL="0" distR="0" wp14:anchorId="4E137B6A" wp14:editId="21709B88">
+            <wp:extent cx="613187" cy="360000"/>
+            <wp:effectExtent l="0" t="0" r="0" b="2540"/>
+            <wp:docPr id="2144186656" name="Picture 1"/>
+            <wp:cNvGraphicFramePr>
+              <a:graphicFrameLocks xmlns:a="http://schemas.openxmlformats.org/drawingml/2006/main" noChangeAspect="1"/>
+            </wp:cNvGraphicFramePr>
+            <a:graphic xmlns:a="http://schemas.openxmlformats.org/drawingml/2006/main">
+              <a:graphicData uri="http://schemas.openxmlformats.org/drawingml/2006/picture">
+                <pic:pic xmlns:pic="http://schemas.openxmlformats.org/drawingml/2006/picture">
+                  <pic:nvPicPr>
+                    <pic:cNvPr id="2144186656" name=""/>
+                    <pic:cNvPicPr/>
+                  </pic:nvPicPr>
+                  <pic:blipFill>
+                    <a:blip r:embed="rId15"/>
+                    <a:stretch>
+                      <a:fillRect/>
+                    </a:stretch>
+                  </pic:blipFill>
+                  <pic:spPr>
+                    <a:xfrm>
+                      <a:off x="0" y="0"/>
+                      <a:ext cx="613187" cy="360000"/>
+                    </a:xfrm>
+                    <a:prstGeom prst="rect">
+                      <a:avLst/>
+                    </a:prstGeom>
+                  </pic:spPr>
+                </pic:pic>
+              </a:graphicData>
+            </a:graphic>
+          </wp:inline>
+        </w:drawing>
+      </w:r>
+      <w:r>
+        <w:t xml:space="preserve">     </w:t>
+      </w:r>
+      <w:r>
+        <w:rPr>
+          <w:noProof/>
+        </w:rPr>
+        <w:drawing>
+          <wp:inline distT="0" distB="0" distL="0" distR="0" wp14:anchorId="1C912381" wp14:editId="73857868">
+            <wp:extent cx="686769" cy="360000"/>
+            <wp:effectExtent l="0" t="0" r="0" b="2540"/>
+            <wp:docPr id="2027864014" name="Picture 1"/>
+            <wp:cNvGraphicFramePr>
+              <a:graphicFrameLocks xmlns:a="http://schemas.openxmlformats.org/drawingml/2006/main" noChangeAspect="1"/>
+            </wp:cNvGraphicFramePr>
+            <a:graphic xmlns:a="http://schemas.openxmlformats.org/drawingml/2006/main">
+              <a:graphicData uri="http://schemas.openxmlformats.org/drawingml/2006/picture">
+                <pic:pic xmlns:pic="http://schemas.openxmlformats.org/drawingml/2006/picture">
+                  <pic:nvPicPr>
+                    <pic:cNvPr id="2027864014" name=""/>
+                    <pic:cNvPicPr/>
+                  </pic:nvPicPr>
+                  <pic:blipFill>
+                    <a:blip r:embed="rId16"/>
+                    <a:stretch>
+                      <a:fillRect/>
+                    </a:stretch>
+                  </pic:blipFill>
+                  <pic:spPr>
+                    <a:xfrm>
+                      <a:off x="0" y="0"/>
+                      <a:ext cx="686769" cy="360000"/>
+                    </a:xfrm>
+                    <a:prstGeom prst="rect">
+                      <a:avLst/>
+                    </a:prstGeom>
+                  </pic:spPr>
+                </pic:pic>
+              </a:graphicData>
+            </a:graphic>
+          </wp:inline>
+        </w:drawing>
+      </w:r>
+      <w:r>
+        <w:t xml:space="preserve">     </w:t>
+      </w:r>
+      <w:r>
+        <w:rPr>
+          <w:noProof/>
+        </w:rPr>
+        <w:drawing>
+          <wp:inline distT="0" distB="0" distL="0" distR="0" wp14:anchorId="29D2622F" wp14:editId="5A627376">
+            <wp:extent cx="668571" cy="360000"/>
+            <wp:effectExtent l="0" t="0" r="0" b="2540"/>
+            <wp:docPr id="1395430719" name="Picture 1"/>
+            <wp:cNvGraphicFramePr>
+              <a:graphicFrameLocks xmlns:a="http://schemas.openxmlformats.org/drawingml/2006/main" noChangeAspect="1"/>
+            </wp:cNvGraphicFramePr>
+            <a:graphic xmlns:a="http://schemas.openxmlformats.org/drawingml/2006/main">
+              <a:graphicData uri="http://schemas.openxmlformats.org/drawingml/2006/picture">
+                <pic:pic xmlns:pic="http://schemas.openxmlformats.org/drawingml/2006/picture">
+                  <pic:nvPicPr>
+                    <pic:cNvPr id="1395430719" name=""/>
+                    <pic:cNvPicPr/>
+                  </pic:nvPicPr>
+                  <pic:blipFill>
+                    <a:blip r:embed="rId17"/>
+                    <a:stretch>
+                      <a:fillRect/>
+                    </a:stretch>
+                  </pic:blipFill>
+                  <pic:spPr>
+                    <a:xfrm>
+                      <a:off x="0" y="0"/>
+                      <a:ext cx="668571" cy="360000"/>
+                    </a:xfrm>
+                    <a:prstGeom prst="rect">
+                      <a:avLst/>
+                    </a:prstGeom>
+                  </pic:spPr>
+                </pic:pic>
+              </a:graphicData>
+            </a:graphic>
+          </wp:inline>
+        </w:drawing>
+      </w:r>
+    </w:p>
     <w:p>
       <w:pPr>
         <w:pStyle w:val="Heading1"/>
       </w:pPr>
       <w:r>
+        <w:lastRenderedPageBreak/>
         <w:t xml:space="preserve">Loading </w:t>
       </w:r>
       <w:r>
@@ -948,19 +859,66 @@
         <w:jc w:val="both"/>
       </w:pPr>
       <w:r>
-        <w:t xml:space="preserve">Data nay be loaded either from </w:t>
-      </w:r>
-      <w:r>
-        <w:rPr>
-          <w:b/>
-          <w:bCs/>
-        </w:rPr>
-        <w:t>Menu-&gt;Load tide(s)…</w:t>
+        <w:t xml:space="preserve">Data </w:t>
+      </w:r>
+      <w:r>
+        <w:t>m</w:t>
+      </w:r>
+      <w:r>
+        <w:t xml:space="preserve">ay be loaded either from </w:t>
+      </w:r>
+      <w:r>
+        <w:t>‘</w:t>
+      </w:r>
+      <w:r>
+        <w:rPr>
+          <w:b/>
+          <w:bCs/>
+        </w:rPr>
+        <w:t>File</w:t>
+      </w:r>
+      <w:r>
+        <w:rPr>
+          <w:b/>
+          <w:bCs/>
+        </w:rPr>
+        <w:t xml:space="preserve"> </w:t>
+      </w:r>
+      <w:r>
+        <w:rPr>
+          <w:b/>
+          <w:bCs/>
+        </w:rPr>
+        <w:t>-&gt;</w:t>
+      </w:r>
+      <w:r>
+        <w:rPr>
+          <w:b/>
+          <w:bCs/>
+        </w:rPr>
+        <w:t xml:space="preserve"> </w:t>
+      </w:r>
+      <w:r>
+        <w:rPr>
+          <w:b/>
+          <w:bCs/>
+        </w:rPr>
+        <w:t>Load tide(s)</w:t>
+      </w:r>
+      <w:r>
+        <w:rPr>
+          <w:b/>
+          <w:bCs/>
+        </w:rPr>
+        <w:t>’</w:t>
       </w:r>
       <w:r>
         <w:t xml:space="preserve"> or by drag-and-drop</w:t>
       </w:r>
       <w:r>
+        <w:t xml:space="preserve"> files into Data plot</w:t>
+      </w:r>
+      <w:r>
         <w:t>. Multiple files loading is supported.</w:t>
       </w:r>
     </w:p>
@@ -969,17 +927,20 @@
         <w:jc w:val="both"/>
       </w:pPr>
       <w:r>
-        <w:t xml:space="preserve">Once loaded, data may be decimated </w:t>
-      </w:r>
-      <w:proofErr w:type="gramStart"/>
-      <w:r>
-        <w:t>in order to</w:t>
-      </w:r>
-      <w:proofErr w:type="gramEnd"/>
-      <w:r>
-        <w:t xml:space="preserve"> reduce redundant data by selecting ‘</w:t>
-      </w:r>
-      <w:proofErr w:type="spellStart"/>
+        <w:t xml:space="preserve">Once loaded, data may be </w:t>
+      </w:r>
+      <w:r>
+        <w:t>decimated,</w:t>
+      </w:r>
+      <w:r>
+        <w:t xml:space="preserve"> </w:t>
+      </w:r>
+      <w:r>
+        <w:t>if necessary,</w:t>
+      </w:r>
+      <w:r>
+        <w:t xml:space="preserve"> by selecting ‘</w:t>
+      </w:r>
       <w:r>
         <w:rPr>
           <w:b/>
@@ -987,16 +948,14 @@
         </w:rPr>
         <w:t>Downsample</w:t>
       </w:r>
-      <w:proofErr w:type="spellEnd"/>
-      <w:r>
-        <w:rPr>
-          <w:b/>
-          <w:bCs/>
-        </w:rPr>
-        <w:t xml:space="preserve"> rate</w:t>
-      </w:r>
-      <w:r>
-        <w:t>’ (every n</w:t>
+      <w:r>
+        <w:t xml:space="preserve">’ </w:t>
+      </w:r>
+      <w:r>
+        <w:t xml:space="preserve">value </w:t>
+      </w:r>
+      <w:r>
+        <w:t>(every n</w:t>
       </w:r>
       <w:r>
         <w:rPr>
@@ -1005,27 +964,55 @@
         <w:t>th</w:t>
       </w:r>
       <w:r>
-        <w:t xml:space="preserve"> sample will be left). Data may be shifted vertically or in time by setting ‘</w:t>
-      </w:r>
-      <w:r>
-        <w:rPr>
-          <w:b/>
-          <w:bCs/>
-        </w:rPr>
-        <w:t>Z shift (m)</w:t>
-      </w:r>
-      <w:r>
-        <w:t>’ and ‘</w:t>
-      </w:r>
-      <w:r>
-        <w:rPr>
-          <w:b/>
-          <w:bCs/>
-        </w:rPr>
-        <w:t>T shift (s)</w:t>
-      </w:r>
-      <w:r>
-        <w:t>’ values. The smoothed data will be shifted accordingly.</w:t>
+        <w:t xml:space="preserve"> sample will be left). Data may be shifted vertically or in time by setting </w:t>
+      </w:r>
+      <w:r>
+        <w:rPr>
+          <w:b/>
+          <w:bCs/>
+        </w:rPr>
+        <w:t>‘</w:t>
+      </w:r>
+      <w:r>
+        <w:rPr>
+          <w:b/>
+          <w:bCs/>
+        </w:rPr>
+        <w:t xml:space="preserve">Apply </w:t>
+      </w:r>
+      <w:r>
+        <w:rPr>
+          <w:b/>
+          <w:bCs/>
+        </w:rPr>
+        <w:t>Z shift (m)’</w:t>
+      </w:r>
+      <w:r>
+        <w:t xml:space="preserve"> and </w:t>
+      </w:r>
+      <w:r>
+        <w:rPr>
+          <w:b/>
+          <w:bCs/>
+        </w:rPr>
+        <w:t>‘</w:t>
+      </w:r>
+      <w:r>
+        <w:rPr>
+          <w:b/>
+          <w:bCs/>
+        </w:rPr>
+        <w:t xml:space="preserve">Apply </w:t>
+      </w:r>
+      <w:r>
+        <w:rPr>
+          <w:b/>
+          <w:bCs/>
+        </w:rPr>
+        <w:t>T shift (s)’</w:t>
+      </w:r>
+      <w:r>
+        <w:t xml:space="preserve"> values.</w:t>
       </w:r>
     </w:p>
     <w:p>
@@ -1033,7 +1020,26 @@
         <w:jc w:val="both"/>
       </w:pPr>
       <w:r>
-        <w:lastRenderedPageBreak/>
+        <w:t>Note that downsampl</w:t>
+      </w:r>
+      <w:r>
+        <w:t>ing</w:t>
+      </w:r>
+      <w:r>
+        <w:t xml:space="preserve"> and shift values are applied to original loaded dataset. Therefore, all the changes (except augmentation) will be reset. You may need to reject </w:t>
+      </w:r>
+      <w:r>
+        <w:t xml:space="preserve">data </w:t>
+      </w:r>
+      <w:r>
+        <w:t>and/or align dataset again. It is recommended to apply shifts and downsampling before any other manipulations.</w:t>
+      </w:r>
+    </w:p>
+    <w:p>
+      <w:pPr>
+        <w:jc w:val="both"/>
+      </w:pPr>
+      <w:r>
         <w:t xml:space="preserve">Data plot may be zoomed in and out by scrolling </w:t>
       </w:r>
       <w:r>
@@ -1044,17 +1050,69 @@
         <w:t>mouse wheel</w:t>
       </w:r>
       <w:r>
-        <w:t xml:space="preserve"> in the data plot. Vertical and horizontal scale may be adjusted by scrolling </w:t>
-      </w:r>
-      <w:r>
-        <w:rPr>
-          <w:b/>
-          <w:bCs/>
-        </w:rPr>
-        <w:t>mouse wheel</w:t>
-      </w:r>
-      <w:r>
-        <w:t xml:space="preserve"> on the respective axis (the axis will be highlighted).</w:t>
+        <w:t xml:space="preserve"> in the data plot. Vertical and horizontal scale may be adjusted </w:t>
+      </w:r>
+      <w:r>
+        <w:t xml:space="preserve">and reset </w:t>
+      </w:r>
+      <w:r>
+        <w:t>by</w:t>
+      </w:r>
+      <w:r>
+        <w:t xml:space="preserve"> pressing buttons:</w:t>
+      </w:r>
+    </w:p>
+    <w:p>
+      <w:pPr>
+        <w:jc w:val="center"/>
+      </w:pPr>
+      <w:r>
+        <w:rPr>
+          <w:noProof/>
+        </w:rPr>
+        <w:drawing>
+          <wp:inline distT="0" distB="0" distL="0" distR="0" wp14:anchorId="7D94ED84" wp14:editId="116D71F1">
+            <wp:extent cx="324396" cy="1080000"/>
+            <wp:effectExtent l="0" t="0" r="0" b="6350"/>
+            <wp:docPr id="1358681093" name="Picture 1"/>
+            <wp:cNvGraphicFramePr>
+              <a:graphicFrameLocks xmlns:a="http://schemas.openxmlformats.org/drawingml/2006/main" noChangeAspect="1"/>
+            </wp:cNvGraphicFramePr>
+            <a:graphic xmlns:a="http://schemas.openxmlformats.org/drawingml/2006/main">
+              <a:graphicData uri="http://schemas.openxmlformats.org/drawingml/2006/picture">
+                <pic:pic xmlns:pic="http://schemas.openxmlformats.org/drawingml/2006/picture">
+                  <pic:nvPicPr>
+                    <pic:cNvPr id="1358681093" name=""/>
+                    <pic:cNvPicPr/>
+                  </pic:nvPicPr>
+                  <pic:blipFill>
+                    <a:blip r:embed="rId18"/>
+                    <a:stretch>
+                      <a:fillRect/>
+                    </a:stretch>
+                  </pic:blipFill>
+                  <pic:spPr>
+                    <a:xfrm>
+                      <a:off x="0" y="0"/>
+                      <a:ext cx="324396" cy="1080000"/>
+                    </a:xfrm>
+                    <a:prstGeom prst="rect">
+                      <a:avLst/>
+                    </a:prstGeom>
+                  </pic:spPr>
+                </pic:pic>
+              </a:graphicData>
+            </a:graphic>
+          </wp:inline>
+        </w:drawing>
+      </w:r>
+    </w:p>
+    <w:p>
+      <w:pPr>
+        <w:pStyle w:val="Heading1"/>
+      </w:pPr>
+      <w:r>
+        <w:t>Data rejection/acceptation</w:t>
       </w:r>
     </w:p>
     <w:p>
@@ -1062,124 +1120,65 @@
         <w:jc w:val="both"/>
       </w:pPr>
       <w:r>
-        <w:t xml:space="preserve">Rectangle selection with </w:t>
-      </w:r>
-      <w:r>
-        <w:rPr>
-          <w:b/>
-          <w:bCs/>
-        </w:rPr>
-        <w:t>r</w:t>
-      </w:r>
-      <w:r>
-        <w:rPr>
-          <w:b/>
-          <w:bCs/>
-        </w:rPr>
-        <w:t>ight mouse button</w:t>
-      </w:r>
-      <w:r>
-        <w:t xml:space="preserve"> will zoom plot to selected limits. </w:t>
-      </w:r>
-      <w:r>
-        <w:rPr>
-          <w:b/>
-          <w:bCs/>
-        </w:rPr>
-        <w:t>Left mouse button</w:t>
-      </w:r>
-      <w:r>
-        <w:t xml:space="preserve"> double-click will restore full view.</w:t>
+        <w:t xml:space="preserve">Erroneous data or spikes may be rejected and re-accepted. </w:t>
+      </w:r>
+      <w:r>
+        <w:t xml:space="preserve">Once </w:t>
+      </w:r>
+      <w:r>
+        <w:rPr>
+          <w:b/>
+          <w:bCs/>
+        </w:rPr>
+        <w:t>‘Reject/Accept’</w:t>
+      </w:r>
+      <w:r>
+        <w:t xml:space="preserve"> button </w:t>
+      </w:r>
+      <w:r>
+        <w:t xml:space="preserve">is </w:t>
+      </w:r>
+      <w:r>
+        <w:t xml:space="preserve">pressed, red rectangle will appear on the Data plot. Press </w:t>
+      </w:r>
+      <w:r>
+        <w:rPr>
+          <w:b/>
+          <w:bCs/>
+        </w:rPr>
+        <w:t>Left/Right mouse button</w:t>
+      </w:r>
+      <w:r>
+        <w:t xml:space="preserve"> to reject/re/accept data. Rectangle may be resized by pressing </w:t>
+      </w:r>
+      <w:r>
+        <w:rPr>
+          <w:b/>
+          <w:bCs/>
+        </w:rPr>
+        <w:t xml:space="preserve">‘1’/’2’ </w:t>
+      </w:r>
+      <w:r>
+        <w:t>keys.</w:t>
+      </w:r>
+      <w:r>
+        <w:t xml:space="preserve"> Press the button again to stop rejection/acceptation mode.</w:t>
       </w:r>
     </w:p>
     <w:p>
       <w:pPr>
         <w:jc w:val="both"/>
-      </w:pPr>
-      <w:r>
-        <w:rPr>
-          <w:b/>
-          <w:bCs/>
-        </w:rPr>
-        <w:t>Right mouse button</w:t>
-      </w:r>
-      <w:r>
-        <w:t xml:space="preserve"> click on the plot will enable additional view options.</w:t>
-      </w:r>
-    </w:p>
-    <w:p>
-      <w:pPr>
-        <w:pStyle w:val="Heading1"/>
-      </w:pPr>
-      <w:r>
-        <w:t>Data rejection/acceptation</w:t>
-      </w:r>
-    </w:p>
-    <w:p>
-      <w:pPr>
-        <w:jc w:val="both"/>
-      </w:pPr>
-      <w:r>
-        <w:t>Erroneous data or spikes may be rejected and re-accepted. To select region for editing hold ‘</w:t>
-      </w:r>
-      <w:r>
-        <w:rPr>
-          <w:b/>
-          <w:bCs/>
-        </w:rPr>
-        <w:t>Ctrl’</w:t>
-      </w:r>
-      <w:r>
-        <w:t xml:space="preserve"> key and select region with </w:t>
-      </w:r>
-      <w:r>
-        <w:rPr>
-          <w:b/>
-          <w:bCs/>
-        </w:rPr>
-        <w:t>right mouse button</w:t>
-      </w:r>
-      <w:r>
-        <w:t xml:space="preserve">. Green </w:t>
-      </w:r>
-      <w:r>
-        <w:t>edit region</w:t>
-      </w:r>
-      <w:r>
-        <w:t xml:space="preserve"> will be shown on data plot. Press ‘</w:t>
-      </w:r>
-      <w:r>
-        <w:rPr>
-          <w:b/>
-          <w:bCs/>
-        </w:rPr>
-        <w:t>Delete</w:t>
-      </w:r>
-      <w:r>
-        <w:t>’ key to reject and ‘</w:t>
-      </w:r>
-      <w:r>
-        <w:rPr>
-          <w:b/>
-          <w:bCs/>
-        </w:rPr>
-        <w:t>Insert</w:t>
-      </w:r>
-      <w:r>
-        <w:t>’. Note that by pressing ‘</w:t>
-      </w:r>
-      <w:r>
-        <w:rPr>
-          <w:b/>
-          <w:bCs/>
-        </w:rPr>
-        <w:t>Delete</w:t>
-      </w:r>
-      <w:r>
-        <w:t xml:space="preserve">’ the data will be interpolated – not deleted. </w:t>
-      </w:r>
-      <w:r>
-        <w:t>Edit region can be moved, resized or re-selected. Note that once selected, it will stay on the data plot until the application is closed.</w:t>
+        <w:rPr>
+          <w:b/>
+          <w:bCs/>
+        </w:rPr>
+      </w:pPr>
+      <w:r>
+        <w:rPr>
+          <w:b/>
+          <w:bCs/>
+        </w:rPr>
+        <w:t>NOTE! Rejected data will not be removed from the dataset but interpolated. Consider that when selecting reject region.</w:t>
       </w:r>
     </w:p>
     <w:p>
@@ -1208,7 +1207,7 @@
         <w:jc w:val="both"/>
       </w:pPr>
       <w:r>
-        <w:t>Finite Impulse Response (FIR);</w:t>
+        <w:t>Gaussian;</w:t>
       </w:r>
     </w:p>
     <w:p>
@@ -1221,7 +1220,7 @@
         <w:jc w:val="both"/>
       </w:pPr>
       <w:r>
-        <w:t>Gaussian;</w:t>
+        <w:t>Finite Impulse Response (FIR);</w:t>
       </w:r>
     </w:p>
     <w:p>
@@ -1265,7 +1264,63 @@
         <w:t>Filter value</w:t>
       </w:r>
       <w:r>
-        <w:t xml:space="preserve">’ control. Note that filter value means different parameters for different filters. Filter takes decimated </w:t>
+        <w:t>’</w:t>
+      </w:r>
+      <w:r>
+        <w:t xml:space="preserve"> </w:t>
+      </w:r>
+      <w:r>
+        <w:t>control.</w:t>
+      </w:r>
+      <w:r>
+        <w:t xml:space="preserve"> The control may be named as </w:t>
+      </w:r>
+      <w:r>
+        <w:rPr>
+          <w:b/>
+          <w:bCs/>
+        </w:rPr>
+        <w:t>‘Sigma’</w:t>
+      </w:r>
+      <w:r>
+        <w:t xml:space="preserve">, </w:t>
+      </w:r>
+      <w:r>
+        <w:rPr>
+          <w:b/>
+          <w:bCs/>
+        </w:rPr>
+        <w:t>’Samples’</w:t>
+      </w:r>
+      <w:r>
+        <w:t xml:space="preserve">, </w:t>
+      </w:r>
+      <w:r>
+        <w:rPr>
+          <w:b/>
+          <w:bCs/>
+        </w:rPr>
+        <w:t>’Kernel’</w:t>
+      </w:r>
+      <w:r>
+        <w:t xml:space="preserve"> or </w:t>
+      </w:r>
+      <w:r>
+        <w:rPr>
+          <w:b/>
+          <w:bCs/>
+        </w:rPr>
+        <w:t>’Window’</w:t>
+      </w:r>
+      <w:r>
+        <w:t xml:space="preserve"> depending on filter type used.</w:t>
+      </w:r>
+      <w:r>
+        <w:t xml:space="preserve"> Note that filter value means different </w:t>
+      </w:r>
+      <w:r>
+        <w:lastRenderedPageBreak/>
+        <w:t xml:space="preserve">parameters for different filters. Filter takes decimated </w:t>
       </w:r>
       <w:r>
         <w:t xml:space="preserve">shifted </w:t>
@@ -1310,7 +1365,28 @@
           <w:b/>
           <w:bCs/>
         </w:rPr>
-        <w:t>Note that due to filtering algorithms, start and end parts of filtered data become distorted. The size of these parts depends on ‘Filter value’. Be cautious when applying in bathy processing. Consider some extra data on both ends of data range.</w:t>
+        <w:t>NOTE!</w:t>
+      </w:r>
+      <w:r>
+        <w:rPr>
+          <w:b/>
+          <w:bCs/>
+        </w:rPr>
+        <w:t xml:space="preserve"> </w:t>
+      </w:r>
+      <w:r>
+        <w:rPr>
+          <w:b/>
+          <w:bCs/>
+        </w:rPr>
+        <w:t>D</w:t>
+      </w:r>
+      <w:r>
+        <w:rPr>
+          <w:b/>
+          <w:bCs/>
+        </w:rPr>
+        <w:t>ue to filtering algorithms, start and end parts of filtered data become distorted. The size of these parts depends on ‘Filter value’. Be cautious when applying in bathy processing. Consider some extra data on both ends of data range.</w:t>
       </w:r>
     </w:p>
     <w:p>
@@ -1318,45 +1394,296 @@
         <w:pStyle w:val="Heading1"/>
       </w:pPr>
       <w:r>
-        <w:t>Settings saving</w:t>
+        <w:t>Data augmentation and alignment</w:t>
       </w:r>
     </w:p>
     <w:p>
       <w:pPr>
         <w:jc w:val="both"/>
-        <w:rPr>
-          <w:b/>
-          <w:bCs/>
-        </w:rPr>
-      </w:pPr>
-      <w:r>
-        <w:t xml:space="preserve">All the settings will be saved to configuration file on application close. The settings will be loaded next time application starts. Config file contents may be checked from </w:t>
-      </w:r>
-      <w:r>
-        <w:rPr>
-          <w:b/>
-          <w:bCs/>
-        </w:rPr>
-        <w:t>Menu-&gt;</w:t>
-      </w:r>
-      <w:r>
-        <w:rPr>
-          <w:rFonts w:ascii="Courier New" w:eastAsia="Times New Roman" w:hAnsi="Courier New" w:cs="Courier New"/>
-          <w:color w:val="6AAB73"/>
-          <w:kern w:val="0"/>
-          <w:sz w:val="20"/>
-          <w:szCs w:val="20"/>
-          <w:lang w:eastAsia="en-GB"/>
-          <w14:ligatures w14:val="none"/>
-        </w:rPr>
-        <w:t xml:space="preserve"> </w:t>
-      </w:r>
-      <w:r>
-        <w:rPr>
-          <w:b/>
-          <w:bCs/>
-        </w:rPr>
-        <w:t>Show settings file...</w:t>
+      </w:pPr>
+      <w:r>
+        <w:t xml:space="preserve">Sometimes processors are provided with water level data acquired only during logging sessions rather than continuous dataset. Depending on variation level, the </w:t>
+      </w:r>
+      <w:r>
+        <w:t>smoothing result may be incorrect,</w:t>
+      </w:r>
+      <w:r>
+        <w:t xml:space="preserve"> if logging was started/stopped at the spike time. Ideally, such datasets should be split by logging sessions and filtered separately. Depending on filter strength, this may make data head</w:t>
+      </w:r>
+      <w:r>
+        <w:t>s</w:t>
+      </w:r>
+      <w:r>
+        <w:t xml:space="preserve"> and tail</w:t>
+      </w:r>
+      <w:r>
+        <w:t>s</w:t>
+      </w:r>
+      <w:r>
+        <w:t xml:space="preserve"> unusable. </w:t>
+      </w:r>
+    </w:p>
+    <w:p>
+      <w:pPr>
+        <w:jc w:val="center"/>
+      </w:pPr>
+      <w:r>
+        <w:rPr>
+          <w:noProof/>
+        </w:rPr>
+        <w:drawing>
+          <wp:inline distT="0" distB="0" distL="0" distR="0" wp14:anchorId="517DF9DB" wp14:editId="718E8C31">
+            <wp:extent cx="4200465" cy="2520000"/>
+            <wp:effectExtent l="0" t="0" r="0" b="0"/>
+            <wp:docPr id="638440801" name="Picture 1"/>
+            <wp:cNvGraphicFramePr>
+              <a:graphicFrameLocks xmlns:a="http://schemas.openxmlformats.org/drawingml/2006/main" noChangeAspect="1"/>
+            </wp:cNvGraphicFramePr>
+            <a:graphic xmlns:a="http://schemas.openxmlformats.org/drawingml/2006/main">
+              <a:graphicData uri="http://schemas.openxmlformats.org/drawingml/2006/picture">
+                <pic:pic xmlns:pic="http://schemas.openxmlformats.org/drawingml/2006/picture">
+                  <pic:nvPicPr>
+                    <pic:cNvPr id="638440801" name=""/>
+                    <pic:cNvPicPr/>
+                  </pic:nvPicPr>
+                  <pic:blipFill>
+                    <a:blip r:embed="rId19"/>
+                    <a:stretch>
+                      <a:fillRect/>
+                    </a:stretch>
+                  </pic:blipFill>
+                  <pic:spPr>
+                    <a:xfrm>
+                      <a:off x="0" y="0"/>
+                      <a:ext cx="4200465" cy="2520000"/>
+                    </a:xfrm>
+                    <a:prstGeom prst="rect">
+                      <a:avLst/>
+                    </a:prstGeom>
+                  </pic:spPr>
+                </pic:pic>
+              </a:graphicData>
+            </a:graphic>
+          </wp:inline>
+        </w:drawing>
+      </w:r>
+    </w:p>
+    <w:p>
+      <w:pPr>
+        <w:jc w:val="both"/>
+      </w:pPr>
+      <w:r>
+        <w:t xml:space="preserve">The way to sort it is to augment and align the </w:t>
+      </w:r>
+      <w:r>
+        <w:t>gaps</w:t>
+      </w:r>
+      <w:r>
+        <w:t>. Augmentation means adding data points at update rate to missing parts of the dataset</w:t>
+      </w:r>
+      <w:r>
+        <w:t xml:space="preserve">. This results in using same filter at the augmented parts. Press </w:t>
+      </w:r>
+      <w:r>
+        <w:rPr>
+          <w:b/>
+          <w:bCs/>
+        </w:rPr>
+        <w:t>‘Augment’</w:t>
+      </w:r>
+      <w:r>
+        <w:t xml:space="preserve"> button to augment dataset. Note that it adds data to original loaded dataset and augmentation will be available until dataset is reloaded. Therefore, the augmentation needs to be done only once.</w:t>
+      </w:r>
+    </w:p>
+    <w:p>
+      <w:pPr>
+        <w:jc w:val="center"/>
+      </w:pPr>
+      <w:r>
+        <w:rPr>
+          <w:noProof/>
+        </w:rPr>
+        <w:lastRenderedPageBreak/>
+        <w:drawing>
+          <wp:inline distT="0" distB="0" distL="0" distR="0" wp14:anchorId="1B1831E4" wp14:editId="116E0024">
+            <wp:extent cx="4200465" cy="2520000"/>
+            <wp:effectExtent l="0" t="0" r="0" b="0"/>
+            <wp:docPr id="542530356" name="Picture 1"/>
+            <wp:cNvGraphicFramePr>
+              <a:graphicFrameLocks xmlns:a="http://schemas.openxmlformats.org/drawingml/2006/main" noChangeAspect="1"/>
+            </wp:cNvGraphicFramePr>
+            <a:graphic xmlns:a="http://schemas.openxmlformats.org/drawingml/2006/main">
+              <a:graphicData uri="http://schemas.openxmlformats.org/drawingml/2006/picture">
+                <pic:pic xmlns:pic="http://schemas.openxmlformats.org/drawingml/2006/picture">
+                  <pic:nvPicPr>
+                    <pic:cNvPr id="542530356" name=""/>
+                    <pic:cNvPicPr/>
+                  </pic:nvPicPr>
+                  <pic:blipFill>
+                    <a:blip r:embed="rId20"/>
+                    <a:stretch>
+                      <a:fillRect/>
+                    </a:stretch>
+                  </pic:blipFill>
+                  <pic:spPr>
+                    <a:xfrm>
+                      <a:off x="0" y="0"/>
+                      <a:ext cx="4200465" cy="2520000"/>
+                    </a:xfrm>
+                    <a:prstGeom prst="rect">
+                      <a:avLst/>
+                    </a:prstGeom>
+                  </pic:spPr>
+                </pic:pic>
+              </a:graphicData>
+            </a:graphic>
+          </wp:inline>
+        </w:drawing>
+      </w:r>
+    </w:p>
+    <w:p>
+      <w:pPr>
+        <w:jc w:val="both"/>
+      </w:pPr>
+      <w:r>
+        <w:t>Apparently, tide value</w:t>
+      </w:r>
+      <w:r>
+        <w:t>s</w:t>
+      </w:r>
+      <w:r>
+        <w:t xml:space="preserve"> at the starts and ends of the missing (augmented) parts </w:t>
+      </w:r>
+      <w:r>
+        <w:t>are</w:t>
+      </w:r>
+      <w:r>
+        <w:t xml:space="preserve"> as it was at the start/end of the logging and may not fit general trend of the data due to noise. Aligning data means interpolation of augmented parts between selected points. Those points (end/start) should be selected as close to data trend as possible. To align data, press </w:t>
+      </w:r>
+      <w:r>
+        <w:rPr>
+          <w:b/>
+          <w:bCs/>
+        </w:rPr>
+        <w:t>‘Align’</w:t>
+      </w:r>
+      <w:r>
+        <w:t xml:space="preserve"> button</w:t>
+      </w:r>
+      <w:r>
+        <w:t xml:space="preserve"> and select start/end points. Those will be marked on the screen.</w:t>
+      </w:r>
+    </w:p>
+    <w:p>
+      <w:pPr>
+        <w:jc w:val="center"/>
+      </w:pPr>
+      <w:r>
+        <w:rPr>
+          <w:noProof/>
+        </w:rPr>
+        <w:drawing>
+          <wp:inline distT="0" distB="0" distL="0" distR="0" wp14:anchorId="2D8B97FD" wp14:editId="43EF9041">
+            <wp:extent cx="4200465" cy="2520000"/>
+            <wp:effectExtent l="0" t="0" r="0" b="0"/>
+            <wp:docPr id="1563121351" name="Picture 1"/>
+            <wp:cNvGraphicFramePr>
+              <a:graphicFrameLocks xmlns:a="http://schemas.openxmlformats.org/drawingml/2006/main" noChangeAspect="1"/>
+            </wp:cNvGraphicFramePr>
+            <a:graphic xmlns:a="http://schemas.openxmlformats.org/drawingml/2006/main">
+              <a:graphicData uri="http://schemas.openxmlformats.org/drawingml/2006/picture">
+                <pic:pic xmlns:pic="http://schemas.openxmlformats.org/drawingml/2006/picture">
+                  <pic:nvPicPr>
+                    <pic:cNvPr id="1563121351" name=""/>
+                    <pic:cNvPicPr/>
+                  </pic:nvPicPr>
+                  <pic:blipFill>
+                    <a:blip r:embed="rId21"/>
+                    <a:stretch>
+                      <a:fillRect/>
+                    </a:stretch>
+                  </pic:blipFill>
+                  <pic:spPr>
+                    <a:xfrm>
+                      <a:off x="0" y="0"/>
+                      <a:ext cx="4200465" cy="2520000"/>
+                    </a:xfrm>
+                    <a:prstGeom prst="rect">
+                      <a:avLst/>
+                    </a:prstGeom>
+                  </pic:spPr>
+                </pic:pic>
+              </a:graphicData>
+            </a:graphic>
+          </wp:inline>
+        </w:drawing>
+      </w:r>
+    </w:p>
+    <w:p>
+      <w:pPr>
+        <w:jc w:val="both"/>
+      </w:pPr>
+      <w:r>
+        <w:t xml:space="preserve">You can align as many segments as possible while the </w:t>
+      </w:r>
+      <w:r>
+        <w:rPr>
+          <w:b/>
+          <w:bCs/>
+        </w:rPr>
+        <w:t>‘Align’</w:t>
+      </w:r>
+      <w:r>
+        <w:t xml:space="preserve"> button is pressed. Press it to stop aligning.</w:t>
+      </w:r>
+      <w:r>
+        <w:t xml:space="preserve"> Then press ‘Filter’ to apply smoothing to the augmented and aligned dataset.</w:t>
+      </w:r>
+    </w:p>
+    <w:p>
+      <w:pPr>
+        <w:jc w:val="center"/>
+      </w:pPr>
+      <w:r>
+        <w:rPr>
+          <w:noProof/>
+        </w:rPr>
+        <w:lastRenderedPageBreak/>
+        <w:drawing>
+          <wp:inline distT="0" distB="0" distL="0" distR="0" wp14:anchorId="58DCC635" wp14:editId="182E0BF2">
+            <wp:extent cx="4200465" cy="2520000"/>
+            <wp:effectExtent l="0" t="0" r="0" b="0"/>
+            <wp:docPr id="660510819" name="Picture 1"/>
+            <wp:cNvGraphicFramePr>
+              <a:graphicFrameLocks xmlns:a="http://schemas.openxmlformats.org/drawingml/2006/main" noChangeAspect="1"/>
+            </wp:cNvGraphicFramePr>
+            <a:graphic xmlns:a="http://schemas.openxmlformats.org/drawingml/2006/main">
+              <a:graphicData uri="http://schemas.openxmlformats.org/drawingml/2006/picture">
+                <pic:pic xmlns:pic="http://schemas.openxmlformats.org/drawingml/2006/picture">
+                  <pic:nvPicPr>
+                    <pic:cNvPr id="660510819" name=""/>
+                    <pic:cNvPicPr/>
+                  </pic:nvPicPr>
+                  <pic:blipFill>
+                    <a:blip r:embed="rId22"/>
+                    <a:stretch>
+                      <a:fillRect/>
+                    </a:stretch>
+                  </pic:blipFill>
+                  <pic:spPr>
+                    <a:xfrm>
+                      <a:off x="0" y="0"/>
+                      <a:ext cx="4200465" cy="2520000"/>
+                    </a:xfrm>
+                    <a:prstGeom prst="rect">
+                      <a:avLst/>
+                    </a:prstGeom>
+                  </pic:spPr>
+                </pic:pic>
+              </a:graphicData>
+            </a:graphic>
+          </wp:inline>
+        </w:drawing>
       </w:r>
     </w:p>
     <w:p>
@@ -1375,25 +1702,28 @@
         <w:t xml:space="preserve">Decimated, shifted and filtered result may be exported to ASCII format either from </w:t>
       </w:r>
       <w:r>
-        <w:rPr>
-          <w:b/>
-          <w:bCs/>
-        </w:rPr>
-        <w:t>Menu-&gt;</w:t>
-      </w:r>
-      <w:r>
-        <w:rPr>
-          <w:b/>
-          <w:bCs/>
-        </w:rPr>
-        <w:t>Save filtered</w:t>
-      </w:r>
-      <w:r>
-        <w:rPr>
-          <w:b/>
-          <w:bCs/>
-        </w:rPr>
-        <w:t>…</w:t>
+        <w:t>‘</w:t>
+      </w:r>
+      <w:r>
+        <w:rPr>
+          <w:b/>
+          <w:bCs/>
+        </w:rPr>
+        <w:t xml:space="preserve">File </w:t>
+      </w:r>
+      <w:r>
+        <w:rPr>
+          <w:b/>
+          <w:bCs/>
+        </w:rPr>
+        <w:t>-&gt;</w:t>
+      </w:r>
+      <w:r>
+        <w:rPr>
+          <w:b/>
+          <w:bCs/>
+        </w:rPr>
+        <w:t xml:space="preserve"> Export’</w:t>
       </w:r>
       <w:r>
         <w:t xml:space="preserve"> or by pressing ‘</w:t>
@@ -1403,18 +1733,20 @@
           <w:b/>
           <w:bCs/>
         </w:rPr>
-        <w:t>Save</w:t>
-      </w:r>
-      <w:r>
-        <w:t xml:space="preserve">’ button. All data will be saved as single file. ‘Date’ </w:t>
-      </w:r>
-      <w:r>
-        <w:lastRenderedPageBreak/>
-        <w:t>and ‘Time’ formats are the same as in the source files. ‘Date’ and ‘Time’ fields will be separated by space, ‘Tide’ field will be separated by comma.</w:t>
+        <w:t>Export</w:t>
+      </w:r>
+      <w:r>
+        <w:t xml:space="preserve"> button. All data will be saved </w:t>
+      </w:r>
+      <w:r>
+        <w:t>into</w:t>
+      </w:r>
+      <w:r>
+        <w:t xml:space="preserve"> single file. ‘Date’ and ‘Time’ formats are the same as in the source files. ‘Date’ and ‘Time’ fields will be separated by space, ‘Tide’ field will be separated by comma.</w:t>
       </w:r>
     </w:p>
     <w:sectPr>
-      <w:footerReference w:type="default" r:id="rId9"/>
+      <w:footerReference w:type="default" r:id="rId23"/>
       <w:pgSz w:w="11906" w:h="16838"/>
       <w:pgMar w:top="1440" w:right="1440" w:bottom="1440" w:left="1440" w:header="708" w:footer="708" w:gutter="0"/>
       <w:cols w:space="708"/>

</xml_diff>